<commit_message>
Reduce passive email harvesting with server-side contact disclosure
</commit_message>
<xml_diff>
--- a/MyPersonalSite/wwwroot/resume/jrp_resume_20260128.docx
+++ b/MyPersonalSite/wwwroot/resume/jrp_resume_20260128.docx
@@ -33,13 +33,23 @@
         </w:rPr>
         <w:t xml:space="preserve"> </w:t>
       </w:r>
+      <w:hyperlink r:id="rId7">
+        <w:r>
+          <w:rPr>
+            <w:rFonts w:ascii="Segoe UI" w:hAnsi="Segoe UI" w:cs="Segoe UI"/>
+            <w:b/>
+            <w:bCs/>
+          </w:rPr>
+          <w:t xml:space="preserve">justinraypalmer.com/contact</w:t>
+        </w:r>
+      </w:hyperlink>
       <w:r>
         <w:rPr>
           <w:rFonts w:ascii="Segoe UI" w:hAnsi="Segoe UI" w:cs="Segoe UI"/>
           <w:b/>
           <w:bCs/>
         </w:rPr>
-        <w:t xml:space="preserve">justinraypalmer@gmail.com | justinpalmer.com </w:t>
+        <w:t xml:space="preserve"> | justinraypalmer.com </w:t>
       </w:r>
     </w:p>
     <w:p>

</xml_diff>